<commit_message>
chore(templates): update contract templates and forms (#601)
Routine refresh of contract template and external-form artifacts and catalog metadata. Contributions are welcome — open an issue or pull request and we'll fold it in.

Co-authored-by: OpenAgreements <noreply@openagreements.org>
</commit_message>
<xml_diff>
--- a/templates/openagreements-cc-by-4.0/openagreements-board-consent-safe/template.docx
+++ b/templates/openagreements-cc-by-4.0/openagreements-board-consent-safe/template.docx
@@ -53,18 +53,6 @@
       </w:r>
       <w:r>
         <w:t xml:space="preserve">, in accordance with terms set forth therein.</w:t>
-      </w:r>
-    </w:p>
-    <w:p>
-      <w:pPr>
-        <w:pStyle w:val="OABody"/>
-      </w:pPr>
-      <w:r>
-        <w:rPr>
-          <w:i/>
-          <w:iCs/>
-        </w:rPr>
-        <w:t xml:space="preserve">Note: The following resolutions do not cover all matters that may need to be addressed in connection with the SAFE financing. For example, if the Company is concurrently amending its certificate of incorporation, converting outstanding convertible notes, or granting pro rata or information rights pursuant to a side letter, additional resolutions will be needed. Always consult with counsel prior to using this consent.</w:t>
       </w:r>
     </w:p>
     <w:p>
@@ -223,7 +211,7 @@
         <w:t xml:space="preserve">RESOLVED FURTHER</w:t>
       </w:r>
       <w:r>
-        <w:t xml:space="preserve">, that each SAFE shall be offered and sold in reliance on any applicable exemption from registration provided by the Securities Act of 1933, as amended, and any applicable exemption under applicable state blue sky laws, and that the officers of the Company be, and each of them hereby is, authorized and directed, for and on behalf of the Company, to execute and file any forms, certificates, notices or other documents that are necessary or appropriate pursuant to federal or state securities laws.</w:t>
+        <w:t xml:space="preserve">, that each SAFE shall be offered and sold in reliance on any applicable exemption from registration provided by the Securities Act of 1933, as amended, and any applicable exemption by applicable state blue sky laws, and that the officers of the Company be, and each of them hereby is, authorized and directed, for and on behalf of the Company, to execute and file any forms, certificates, notices or other documents that are necessary or appropriate pursuant to federal or state securities laws.</w:t>
       </w:r>
     </w:p>
     <w:p>
@@ -294,7 +282,7 @@
         <w:pStyle w:val="OABody"/>
       </w:pPr>
       <w:r>
-        <w:t xml:space="preserve">The undersigned have executed this Action by Written Consent as of the date set forth under his or her name below. Any copy, facsimile, .PDF or other reliable reproduction of this Action by Written Consent may be substituted or used in lieu of the original writing for any and all purposes for which the original writing could be used, provided that such copy, facsimile, .PDF or other reproduction be a complete reproduction of the entire original writing.</w:t>
+        <w:t xml:space="preserve">The undersigned have executed this Action by Written Consent as of the date set forth under his or her name below. Any copy, facsimile,.PDF or other reliable reproduction of this Action by Written Consent may be substituted or used in lieu of the original writing for any and all purposes for which the original writing could be used, provided that such copy, facsimile,.PDF or other reproduction be a complete reproduction of the entire original writing.</w:t>
       </w:r>
     </w:p>
     <w:p>

</xml_diff>

<commit_message>
chore(templates): update contract templates and forms (#627)
Routine refresh of contract template and external-form artifacts and catalog metadata. Contributions are welcome — open an issue or pull request and we'll fold it in.

Co-authored-by: OpenAgreements <noreply@openagreements.org>
</commit_message>
<xml_diff>
--- a/templates/openagreements-cc-by-4.0/openagreements-board-consent-safe/template.docx
+++ b/templates/openagreements-cc-by-4.0/openagreements-board-consent-safe/template.docx
@@ -211,7 +211,7 @@
         <w:t xml:space="preserve">RESOLVED FURTHER</w:t>
       </w:r>
       <w:r>
-        <w:t xml:space="preserve">, that each SAFE shall be offered and sold in reliance on any applicable exemption from registration provided by the Securities Act of 1933, as amended, and any applicable exemption by applicable state blue sky laws, and that the officers of the Company be, and each of them hereby is, authorized and directed, for and on behalf of the Company, to execute and file any forms, certificates, notices or other documents that are necessary or appropriate pursuant to federal or state securities laws.</w:t>
+        <w:t xml:space="preserve">, that each SAFE shall be offered and sold in reliance on any applicable exemption from registration provided by the Securities Act of 1933, as amended, and any applicable exemption under applicable state blue sky laws, and that the officers of the Company be, and each of them hereby is, authorized and directed, for and on behalf of the Company, to execute and file any forms, certificates, notices or other documents that are necessary or appropriate pursuant to federal or state securities laws.</w:t>
       </w:r>
     </w:p>
     <w:p>
@@ -282,7 +282,7 @@
         <w:pStyle w:val="OABody"/>
       </w:pPr>
       <w:r>
-        <w:t xml:space="preserve">The undersigned have executed this Action by Written Consent as of the date set forth under his or her name below. Any copy, facsimile,.PDF or other reliable reproduction of this Action by Written Consent may be substituted or used in lieu of the original writing for any and all purposes for which the original writing could be used, provided that such copy, facsimile,.PDF or other reproduction be a complete reproduction of the entire original writing.</w:t>
+        <w:t xml:space="preserve">The undersigned have executed this Action by Written Consent as of the date set forth under his or her name below. Any copy, facsimile, .PDF or other reliable reproduction of this Action by Written Consent may be substituted or used in lieu of the original writing for any and all purposes for which the original writing could be used, provided that such copy, facsimile, .PDF or other reproduction be a complete reproduction of the entire original writing.</w:t>
       </w:r>
     </w:p>
     <w:p>

</xml_diff>

<commit_message>
chore(templates): update contract templates and forms (#647)
Routine refresh of contract template and external-form artifacts and catalog metadata. Contributions are welcome — open an issue or pull request and we'll fold it in.

Co-authored-by: OpenAgreements <noreply@openagreements.org>
</commit_message>
<xml_diff>
--- a/templates/openagreements-cc-by-4.0/openagreements-board-consent-safe/template.docx
+++ b/templates/openagreements-cc-by-4.0/openagreements-board-consent-safe/template.docx
@@ -950,169 +950,79 @@
 
 <file path=word/header1.xml><?xml version="1.0" encoding="utf-8"?>
 <w:hdr xmlns:w="http://schemas.openxmlformats.org/wordprocessingml/2006/main" xmlns:r="http://schemas.openxmlformats.org/officeDocument/2006/relationships">
-  <w:tbl>
-    <w:tblPr>
-      <w:tblW w:w="10080" w:type="dxa"/>
-      <w:tblBorders>
-        <w:top w:val="none" w:sz="0" w:space="0" w:color="auto"/>
-        <w:left w:val="none" w:sz="0" w:space="0" w:color="auto"/>
+  <w:p>
+    <w:pPr>
+      <w:pBdr>
         <w:bottom w:val="single" w:sz="8" w:space="0" w:color="107087"/>
-        <w:right w:val="none" w:sz="0" w:space="0" w:color="auto"/>
-        <w:insideH w:val="none" w:sz="0" w:space="0" w:color="auto"/>
-        <w:insideV w:val="none" w:sz="0" w:space="0" w:color="auto"/>
-      </w:tblBorders>
-      <w:tblLayout w:type="fixed"/>
-    </w:tblPr>
-    <w:tblGrid>
-      <w:gridCol w:w="10080"/>
-    </w:tblGrid>
-    <w:tr>
-      <w:tc>
-        <w:tcPr>
-          <w:tcW w:w="10080" w:type="dxa"/>
-          <w:tcBorders>
-            <w:bottom w:val="single" w:sz="8" w:space="0" w:color="107087"/>
-          </w:tcBorders>
-          <w:tcMar>
-            <w:top w:w="0" w:type="dxa"/>
-            <w:left w:w="0" w:type="dxa"/>
-            <w:bottom w:w="40" w:type="dxa"/>
-            <w:right w:w="0" w:type="dxa"/>
-          </w:tcMar>
-        </w:tcPr>
-        <w:p>
-          <w:pPr>
-            <w:spacing w:after="0"/>
-            <w:jc w:val="right"/>
-          </w:pPr>
-          <w:r>
-            <w:rPr>
-              <w:rFonts w:ascii="Arial" w:hAnsi="Arial" w:cs="Arial"/>
-              <w:b/>
-              <w:bCs/>
-              <w:caps/>
-              <w:color w:val="107087"/>
-              <w:sz w:val="18"/>
-              <w:szCs w:val="18"/>
-            </w:rPr>
-            <w:t xml:space="preserve">Consent</w:t>
-          </w:r>
-        </w:p>
-      </w:tc>
-    </w:tr>
-  </w:tbl>
+      </w:pBdr>
+      <w:spacing w:after="0"/>
+      <w:jc w:val="right"/>
+    </w:pPr>
+    <w:r>
+      <w:rPr>
+        <w:rFonts w:ascii="Arial" w:hAnsi="Arial" w:cs="Arial"/>
+        <w:b/>
+        <w:bCs/>
+        <w:caps/>
+        <w:color w:val="107087"/>
+        <w:sz w:val="18"/>
+        <w:szCs w:val="18"/>
+      </w:rPr>
+      <w:t xml:space="preserve">Consent</w:t>
+    </w:r>
+  </w:p>
 </w:hdr>
 </file>
 
 <file path=word/header2.xml><?xml version="1.0" encoding="utf-8"?>
 <w:hdr xmlns:w="http://schemas.openxmlformats.org/wordprocessingml/2006/main" xmlns:r="http://schemas.openxmlformats.org/officeDocument/2006/relationships">
-  <w:tbl>
-    <w:tblPr>
-      <w:tblW w:w="10080" w:type="dxa"/>
-      <w:tblBorders>
-        <w:top w:val="none" w:sz="0" w:space="0" w:color="auto"/>
-        <w:left w:val="none" w:sz="0" w:space="0" w:color="auto"/>
+  <w:p>
+    <w:pPr>
+      <w:pBdr>
         <w:bottom w:val="single" w:sz="8" w:space="0" w:color="107087"/>
-        <w:right w:val="none" w:sz="0" w:space="0" w:color="auto"/>
-        <w:insideH w:val="none" w:sz="0" w:space="0" w:color="auto"/>
-        <w:insideV w:val="none" w:sz="0" w:space="0" w:color="auto"/>
-      </w:tblBorders>
-      <w:tblLayout w:type="fixed"/>
-    </w:tblPr>
-    <w:tblGrid>
-      <w:gridCol w:w="10080"/>
-    </w:tblGrid>
-    <w:tr>
-      <w:tc>
-        <w:tcPr>
-          <w:tcW w:w="10080" w:type="dxa"/>
-          <w:tcBorders>
-            <w:bottom w:val="single" w:sz="8" w:space="0" w:color="107087"/>
-          </w:tcBorders>
-          <w:tcMar>
-            <w:top w:w="0" w:type="dxa"/>
-            <w:left w:w="0" w:type="dxa"/>
-            <w:bottom w:w="40" w:type="dxa"/>
-            <w:right w:w="0" w:type="dxa"/>
-          </w:tcMar>
-        </w:tcPr>
-        <w:p>
-          <w:pPr>
-            <w:spacing w:after="0"/>
-            <w:jc w:val="right"/>
-          </w:pPr>
-          <w:r>
-            <w:rPr>
-              <w:rFonts w:ascii="Arial" w:hAnsi="Arial" w:cs="Arial"/>
-              <w:b/>
-              <w:bCs/>
-              <w:caps/>
-              <w:color w:val="107087"/>
-              <w:sz w:val="18"/>
-              <w:szCs w:val="18"/>
-            </w:rPr>
-            <w:t xml:space="preserve">Resolutions</w:t>
-          </w:r>
-        </w:p>
-      </w:tc>
-    </w:tr>
-  </w:tbl>
+      </w:pBdr>
+      <w:spacing w:after="0"/>
+      <w:jc w:val="right"/>
+    </w:pPr>
+    <w:r>
+      <w:rPr>
+        <w:rFonts w:ascii="Arial" w:hAnsi="Arial" w:cs="Arial"/>
+        <w:b/>
+        <w:bCs/>
+        <w:caps/>
+        <w:color w:val="107087"/>
+        <w:sz w:val="18"/>
+        <w:szCs w:val="18"/>
+      </w:rPr>
+      <w:t xml:space="preserve">Resolutions</w:t>
+    </w:r>
+  </w:p>
 </w:hdr>
 </file>
 
 <file path=word/header3.xml><?xml version="1.0" encoding="utf-8"?>
 <w:hdr xmlns:w="http://schemas.openxmlformats.org/wordprocessingml/2006/main" xmlns:r="http://schemas.openxmlformats.org/officeDocument/2006/relationships">
-  <w:tbl>
-    <w:tblPr>
-      <w:tblW w:w="10080" w:type="dxa"/>
-      <w:tblBorders>
-        <w:top w:val="none" w:sz="0" w:space="0" w:color="auto"/>
-        <w:left w:val="none" w:sz="0" w:space="0" w:color="auto"/>
+  <w:p>
+    <w:pPr>
+      <w:pBdr>
         <w:bottom w:val="single" w:sz="8" w:space="0" w:color="107087"/>
-        <w:right w:val="none" w:sz="0" w:space="0" w:color="auto"/>
-        <w:insideH w:val="none" w:sz="0" w:space="0" w:color="auto"/>
-        <w:insideV w:val="none" w:sz="0" w:space="0" w:color="auto"/>
-      </w:tblBorders>
-      <w:tblLayout w:type="fixed"/>
-    </w:tblPr>
-    <w:tblGrid>
-      <w:gridCol w:w="10080"/>
-    </w:tblGrid>
-    <w:tr>
-      <w:tc>
-        <w:tcPr>
-          <w:tcW w:w="10080" w:type="dxa"/>
-          <w:tcBorders>
-            <w:bottom w:val="single" w:sz="8" w:space="0" w:color="107087"/>
-          </w:tcBorders>
-          <w:tcMar>
-            <w:top w:w="0" w:type="dxa"/>
-            <w:left w:w="0" w:type="dxa"/>
-            <w:bottom w:w="40" w:type="dxa"/>
-            <w:right w:w="0" w:type="dxa"/>
-          </w:tcMar>
-        </w:tcPr>
-        <w:p>
-          <w:pPr>
-            <w:spacing w:after="0"/>
-            <w:jc w:val="right"/>
-          </w:pPr>
-          <w:r>
-            <w:rPr>
-              <w:rFonts w:ascii="Arial" w:hAnsi="Arial" w:cs="Arial"/>
-              <w:b/>
-              <w:bCs/>
-              <w:caps/>
-              <w:color w:val="107087"/>
-              <w:sz w:val="18"/>
-              <w:szCs w:val="18"/>
-            </w:rPr>
-            <w:t xml:space="preserve">Signature Page</w:t>
-          </w:r>
-        </w:p>
-      </w:tc>
-    </w:tr>
-  </w:tbl>
+      </w:pBdr>
+      <w:spacing w:after="0"/>
+      <w:jc w:val="right"/>
+    </w:pPr>
+    <w:r>
+      <w:rPr>
+        <w:rFonts w:ascii="Arial" w:hAnsi="Arial" w:cs="Arial"/>
+        <w:b/>
+        <w:bCs/>
+        <w:caps/>
+        <w:color w:val="107087"/>
+        <w:sz w:val="18"/>
+        <w:szCs w:val="18"/>
+      </w:rPr>
+      <w:t xml:space="preserve">Signature Page</w:t>
+    </w:r>
+  </w:p>
 </w:hdr>
 </file>
 

</xml_diff>